<commit_message>
LG-05: Bezeichnung der kommentierten Fassung korrigiert
Das Dokument nannte 1.0.0-ballot-rc.2 als kommentierte Fassung. Das war
ein Fehlschluss von den Git-Tags: rc.1 und rc.2 sind Release Candidates,
die als Unterverzeichnisse auf gh-pages liegen. Kommentiert wurde
1.0.0-ballot - unter dieser Versionsnummer wurde zwischen 30.07. und
28.09. zwanzig Mal veroeffentlicht.

An der Sachaussage aendert das nichts: Die letzte Veroeffentlichung vor
Beginn der Kommentarumsetzungen (03.08.) enthaelt onko-therapy-line,
onko-condition und onko-diagnostic-care-plan, aber keine Episodenart-
Artefakte. Der Umbau war nie committet und konnte daher in keinem
CI-Build enthalten sein.

Co-Authored-By: Claude Opus 5 (1M context) <noreply@anthropic.com>
Claude-Session: https://claude.ai/code/session_01CHe4fBkxTKxQQ8AygQwLk9
</commit_message>
<xml_diff>
--- a/docs/L05-MII-Ueberleitung/LG-05_Ueberleitung_MII_Onkologie.docx
+++ b/docs/L05-MII-Ueberleitung/LG-05_Ueberleitung_MII_Onkologie.docx
@@ -298,7 +298,7 @@
         <w:t xml:space="preserve">feat/episodenart-auf-main</w:t>
       </w:r>
       <w:r>
-        <w:t xml:space="preserve">), aufsetzend auf der kommentierten Ballot-Fassung</w:t>
+        <w:t xml:space="preserve">), aufsetzend auf der kommentierten Fassung</w:t>
       </w:r>
       <w:r>
         <w:t xml:space="preserve"> </w:t>
@@ -307,7 +307,7 @@
         <w:rPr>
           <w:rStyle w:val="VerbatimChar"/>
         </w:rPr>
-        <w:t xml:space="preserve">1.0.0-ballot-rc.2</w:t>
+        <w:t xml:space="preserve">1.0.0-ballot</w:t>
       </w:r>
       <w:r>
         <w:t xml:space="preserve"> </w:t>
@@ -1661,13 +1661,13 @@
         <w:rPr>
           <w:rStyle w:val="VerbatimChar"/>
         </w:rPr>
-        <w:t xml:space="preserve">1.0.0-ballot-rc.2</w:t>
-      </w:r>
-      <w:r>
-        <w:t xml:space="preserve"> </w:t>
-      </w:r>
-      <w:r>
-        <w:t xml:space="preserve">(31.07.2026). Seither ist der Leitfaden in zwei Schritten fortentwickelt worden: zunächst durch die</w:t>
+        <w:t xml:space="preserve">1.0.0-ballot</w:t>
+      </w:r>
+      <w:r>
+        <w:t xml:space="preserve"> </w:t>
+      </w:r>
+      <w:r>
+        <w:t xml:space="preserve">— zuletzt vor Beginn der Kommentarumsetzungen am 03.08.2026 veröffentlicht. Seither ist der Leitfaden in zwei Schritten fortentwickelt worden: zunächst durch die</w:t>
       </w:r>
       <w:r>
         <w:t xml:space="preserve"> </w:t>
@@ -14875,7 +14875,7 @@
               <w:rPr>
                 <w:rStyle w:val="VerbatimChar"/>
               </w:rPr>
-              <w:t xml:space="preserve">1.0.0-ballot-rc.2</w:t>
+              <w:t xml:space="preserve">1.0.0-ballot</w:t>
             </w:r>
             <w:r>
               <w:t xml:space="preserve">, das ihn nicht enthält</w:t>

</xml_diff>

<commit_message>
LG-05 als finale Fassung
- Kopf ohne Branch-Referenz und ohne Entwurfsvermerk; Bezugsfassung als
  aktueller Stand nach Kommentarumsetzung und Episodenart-Umbau.
- Erledigte Arbeitspakete und Durchstreichungen entfernt; entfallene
  Profile im Anhang sachlich statt durchgestrichen ausgewiesen.
- Risiko zum ausstehenden Umbau auf die verbleibende Pflicht reduziert:
  die Fortentwicklung gegenueber der kommentierten Fassung im Kommentar
  offenlegen.
- Risikotabelle durchnummeriert (eine Nummer stand ausser der Reihe).
- Antwortmatrix: Kommentar 3 aufgeloest - er meinte dieselbe Bitte wie
  Kommentar 14 (Binding-Spalte und ausgeschriebene Antwortmoeglichkeiten
  in der Terminologietabelle), beides in 6.1 umgesetzt. Damit ist kein
  Kommentar mehr offen.

Co-Authored-By: Claude Opus 5 (1M context) <noreply@anthropic.com>
Claude-Session: https://claude.ai/code/session_01CHe4fBkxTKxQQ8AygQwLk9
</commit_message>
<xml_diff>
--- a/docs/L05-MII-Ueberleitung/LG-05_Ueberleitung_MII_Onkologie.docx
+++ b/docs/L05-MII-Ueberleitung/LG-05_Ueberleitung_MII_Onkologie.docx
@@ -162,7 +162,7 @@
           <w:color w:val="003754"/>
           <w:sz w:val="22"/>
         </w:rPr>
-        <w:t>30.09.2026 · V3</w:t>
+        <w:t>30.09.2026</w:t>
       </w:r>
     </w:p>
     <w:p>
@@ -270,7 +270,7 @@
         <w:t xml:space="preserve"> </w:t>
       </w:r>
       <w:r>
-        <w:t xml:space="preserve">Entwurf V3 · 30. September 2026</w:t>
+        <w:t xml:space="preserve">30. September 2026</w:t>
       </w:r>
       <w:r>
         <w:t xml:space="preserve"> </w:t>
@@ -286,7 +286,7 @@
         <w:t xml:space="preserve"> </w:t>
       </w:r>
       <w:r>
-        <w:t xml:space="preserve">Arbeitsstand nach dem Episodenart-Umbau (Branch</w:t>
+        <w:t xml:space="preserve">aktueller Stand nach Umsetzung der Ballot-Kommentare und dem Episodenart-Umbau, aufsetzend auf der kommentierten Fassung</w:t>
       </w:r>
       <w:r>
         <w:t xml:space="preserve"> </w:t>
@@ -295,25 +295,7 @@
         <w:rPr>
           <w:rStyle w:val="VerbatimChar"/>
         </w:rPr>
-        <w:t xml:space="preserve">feat/episodenart-auf-main</w:t>
-      </w:r>
-      <w:r>
-        <w:t xml:space="preserve">), aufsetzend auf der kommentierten Fassung</w:t>
-      </w:r>
-      <w:r>
-        <w:t xml:space="preserve"> </w:t>
-      </w:r>
-      <w:r>
-        <w:rPr>
-          <w:rStyle w:val="VerbatimChar"/>
-        </w:rPr>
         <w:t xml:space="preserve">1.0.0-ballot</w:t>
-      </w:r>
-      <w:r>
-        <w:t xml:space="preserve"> </w:t>
-      </w:r>
-      <w:r>
-        <w:t xml:space="preserve">und deren Kommentarumsetzungen</w:t>
       </w:r>
       <w:r>
         <w:t xml:space="preserve"> </w:t>
@@ -1178,7 +1160,7 @@
         <w:pStyle w:val="FirstParagraph"/>
       </w:pPr>
       <w:r>
-        <w:t xml:space="preserve">Gegenstand sind sämtliche im Leitfaden definierten Artefakte im aktuellen Arbeitsstand:</w:t>
+        <w:t xml:space="preserve">Gegenstand sind sämtliche im Leitfaden definierten Artefakte im aktuellen Stand:</w:t>
       </w:r>
     </w:p>
     <w:p>
@@ -1723,7 +1705,7 @@
         <w:t xml:space="preserve">Episodenart-Umbau</w:t>
       </w:r>
       <w:r>
-        <w:t xml:space="preserve">. Dieses Dokument beschreibt den Stand nach beiden Schritten. Wo er von der kommentierten Fassung abweicht, ist das ausgewiesen; der Kommentar selbst muss diese Fortentwicklung offenlegen (Risiko 4a).</w:t>
+        <w:t xml:space="preserve">. Dieses Dokument beschreibt den Stand nach beiden Schritten. Wo er von der kommentierten Fassung abweicht, ist das ausgewiesen; der Kommentar selbst muss diese Fortentwicklung offenlegen (Risiko 6).</w:t>
       </w:r>
     </w:p>
     <w:bookmarkEnd w:id="27"/>
@@ -5279,7 +5261,7 @@
         <w:t xml:space="preserve"> </w:t>
       </w:r>
       <w:r>
-        <w:t xml:space="preserve">anzustreben, damit auch der ambulante Sektor, Reha und die Vernetzungsstandards darauf aufsetzen können, ohne ISiK zu implementieren. Die MII-Ableitung zieht dann auf die Kernprofil-Fassung um. Praktisch heißt das für den jetzigen Entwurf: Die ISiK-Einreichung darf keine Festlegungen treffen, die nur im stationären Kontext tragen — die Kernprofil-Fähigkeit ist von Beginn an mitzudenken, auch wenn die Überführung erst später ansteht.</w:t>
+        <w:t xml:space="preserve">anzustreben, damit auch der ambulante Sektor, Reha und die Vernetzungsstandards darauf aufsetzen können, ohne ISiK zu implementieren. Die MII-Ableitung zieht dann auf die Kernprofil-Fassung um. Praktisch heißt das für die jetzige Modellierung: Die ISiK-Einreichung darf keine Festlegungen treffen, die nur im stationären Kontext tragen — die Kernprofil-Fähigkeit ist von Beginn an mitzudenken, auch wenn die Überführung erst später ansteht.</w:t>
       </w:r>
     </w:p>
     <w:p>
@@ -14132,74 +14114,6 @@
               <w:pStyle w:val="Compact"/>
             </w:pPr>
             <w:r>
-              <w:t xml:space="preserve">5a</w:t>
-            </w:r>
-          </w:p>
-        </w:tc>
-        <w:tc>
-          <w:tcPr/>
-          <w:p>
-            <w:pPr>
-              <w:pStyle w:val="Compact"/>
-            </w:pPr>
-            <w:r>
-              <w:rPr>
-                <w:strike/>
-              </w:rPr>
-              <w:t xml:space="preserve">Umbau im Leitfaden: Intentions-ValueSet bereinigen, Kontext-Achse</w:t>
-            </w:r>
-          </w:p>
-        </w:tc>
-        <w:tc>
-          <w:tcPr/>
-          <w:p>
-            <w:pPr>
-              <w:pStyle w:val="Compact"/>
-            </w:pPr>
-            <w:r>
-              <w:t xml:space="preserve">—</w:t>
-            </w:r>
-          </w:p>
-        </w:tc>
-        <w:tc>
-          <w:tcPr/>
-          <w:p>
-            <w:pPr>
-              <w:pStyle w:val="Compact"/>
-            </w:pPr>
-            <w:r>
-              <w:rPr>
-                <w:b/>
-                <w:bCs/>
-              </w:rPr>
-              <w:t xml:space="preserve">erledigt</w:t>
-            </w:r>
-            <w:r>
-              <w:t xml:space="preserve"> </w:t>
-            </w:r>
-            <w:r>
-              <w:t xml:space="preserve">— neoadjuvant/adjuvant stehen in</w:t>
-            </w:r>
-            <w:r>
-              <w:t xml:space="preserve"> </w:t>
-            </w:r>
-            <w:r>
-              <w:rPr>
-                <w:rStyle w:val="VerbatimChar"/>
-              </w:rPr>
-              <w:t xml:space="preserve">onko-service-request-kontext</w:t>
-            </w:r>
-          </w:p>
-        </w:tc>
-      </w:tr>
-      <w:tr>
-        <w:tc>
-          <w:tcPr/>
-          <w:p>
-            <w:pPr>
-              <w:pStyle w:val="Compact"/>
-            </w:pPr>
-            <w:r>
               <w:t xml:space="preserve">6</w:t>
             </w:r>
           </w:p>
@@ -14749,7 +14663,7 @@
               <w:jc w:val="right"/>
             </w:pPr>
             <w:r>
-              <w:t xml:space="preserve">9</w:t>
+              <w:t xml:space="preserve">4</w:t>
             </w:r>
           </w:p>
         </w:tc>
@@ -14796,7 +14710,7 @@
               <w:jc w:val="right"/>
             </w:pPr>
             <w:r>
-              <w:t xml:space="preserve">4</w:t>
+              <w:t xml:space="preserve">5</w:t>
             </w:r>
           </w:p>
         </w:tc>
@@ -14843,30 +14757,18 @@
               <w:jc w:val="right"/>
             </w:pPr>
             <w:r>
-              <w:t xml:space="preserve">4a</w:t>
-            </w:r>
-          </w:p>
-        </w:tc>
-        <w:tc>
-          <w:tcPr/>
-          <w:p>
-            <w:pPr>
-              <w:pStyle w:val="Compact"/>
-            </w:pPr>
-            <w:r>
-              <w:t xml:space="preserve">Der Episodenart-Umbau ist noch nicht in</w:t>
-            </w:r>
-            <w:r>
-              <w:t xml:space="preserve"> </w:t>
-            </w:r>
-            <w:r>
-              <w:rPr>
-                <w:rStyle w:val="VerbatimChar"/>
-              </w:rPr>
-              <w:t xml:space="preserve">main</w:t>
-            </w:r>
-            <w:r>
-              <w:t xml:space="preserve">; die Kommentierung lief auf</w:t>
+              <w:t xml:space="preserve">6</w:t>
+            </w:r>
+          </w:p>
+        </w:tc>
+        <w:tc>
+          <w:tcPr/>
+          <w:p>
+            <w:pPr>
+              <w:pStyle w:val="Compact"/>
+            </w:pPr>
+            <w:r>
+              <w:t xml:space="preserve">Der eingereichte Stand ist gegenüber der kommentierten Fassung fortentwickelt:</w:t>
             </w:r>
             <w:r>
               <w:t xml:space="preserve"> </w:t>
@@ -14878,44 +14780,32 @@
               <w:t xml:space="preserve">1.0.0-ballot</w:t>
             </w:r>
             <w:r>
-              <w:t xml:space="preserve">, das ihn nicht enthält</w:t>
-            </w:r>
-          </w:p>
-        </w:tc>
-        <w:tc>
-          <w:tcPr/>
-          <w:p>
-            <w:pPr>
-              <w:pStyle w:val="Compact"/>
-            </w:pPr>
-            <w:r>
-              <w:t xml:space="preserve">Der Kommentar beschreibt einen Stand, den die Kommentierenden nicht gesehen haben</w:t>
-            </w:r>
-          </w:p>
-        </w:tc>
-        <w:tc>
-          <w:tcPr/>
-          <w:p>
-            <w:pPr>
-              <w:pStyle w:val="Compact"/>
-            </w:pPr>
-            <w:r>
-              <w:t xml:space="preserve">Umbau vor AP 1 nach</w:t>
-            </w:r>
-            <w:r>
               <w:t xml:space="preserve"> </w:t>
             </w:r>
             <w:r>
-              <w:rPr>
-                <w:rStyle w:val="VerbatimChar"/>
-              </w:rPr>
-              <w:t xml:space="preserve">main</w:t>
-            </w:r>
-            <w:r>
-              <w:t xml:space="preserve"> </w:t>
-            </w:r>
-            <w:r>
-              <w:t xml:space="preserve">bringen und im Kommentar ausdrücklich als Fortentwicklung gegenüber der kommentierten Fassung kennzeichnen</w:t>
+              <w:t xml:space="preserve">enthielt weder den Episodenart-Umbau noch die Trennung von Intention und Kontext</w:t>
+            </w:r>
+          </w:p>
+        </w:tc>
+        <w:tc>
+          <w:tcPr/>
+          <w:p>
+            <w:pPr>
+              <w:pStyle w:val="Compact"/>
+            </w:pPr>
+            <w:r>
+              <w:t xml:space="preserve">Der Kommentar beschreibt ein Modell, das die Kommentierenden in dieser Form nicht gesehen haben</w:t>
+            </w:r>
+          </w:p>
+        </w:tc>
+        <w:tc>
+          <w:tcPr/>
+          <w:p>
+            <w:pPr>
+              <w:pStyle w:val="Compact"/>
+            </w:pPr>
+            <w:r>
+              <w:t xml:space="preserve">Im Kommentar ausdrücklich als Fortentwicklung kennzeichnen und die beiden Schritte benennen (2.1); der Leitfaden selbst trägt den beschriebenen Stand</w:t>
             </w:r>
           </w:p>
         </w:tc>
@@ -14929,7 +14819,7 @@
               <w:jc w:val="right"/>
             </w:pPr>
             <w:r>
-              <w:t xml:space="preserve">5</w:t>
+              <w:t xml:space="preserve">7</w:t>
             </w:r>
           </w:p>
         </w:tc>
@@ -14976,7 +14866,7 @@
               <w:jc w:val="right"/>
             </w:pPr>
             <w:r>
-              <w:t xml:space="preserve">6</w:t>
+              <w:t xml:space="preserve">8</w:t>
             </w:r>
           </w:p>
         </w:tc>
@@ -15038,7 +14928,7 @@
               <w:jc w:val="right"/>
             </w:pPr>
             <w:r>
-              <w:t xml:space="preserve">7</w:t>
+              <w:t xml:space="preserve">9</w:t>
             </w:r>
           </w:p>
         </w:tc>
@@ -15085,7 +14975,7 @@
               <w:jc w:val="right"/>
             </w:pPr>
             <w:r>
-              <w:t xml:space="preserve">8</w:t>
+              <w:t xml:space="preserve">10</w:t>
             </w:r>
           </w:p>
         </w:tc>
@@ -15489,9 +15379,18 @@
             <w:r>
               <w:rPr>
                 <w:rStyle w:val="VerbatimChar"/>
-                <w:strike/>
               </w:rPr>
               <w:t xml:space="preserve">onko-diagnostic-care-plan</w:t>
+            </w:r>
+            <w:r>
+              <w:t xml:space="preserve"> </w:t>
+            </w:r>
+            <w:r>
+              <w:rPr>
+                <w:i/>
+                <w:iCs/>
+              </w:rPr>
+              <w:t xml:space="preserve">(entfallen)</w:t>
             </w:r>
           </w:p>
         </w:tc>
@@ -15528,7 +15427,7 @@
               <w:pStyle w:val="Compact"/>
             </w:pPr>
             <w:r>
-              <w:t xml:space="preserve">im Zuge der Kommentierung entfallen; Unterscheidung über</w:t>
+              <w:t xml:space="preserve">im Zuge der Kommentierung gestrichen; Unterscheidung läuft über</w:t>
             </w:r>
             <w:r>
               <w:t xml:space="preserve"> </w:t>
@@ -15664,9 +15563,18 @@
             <w:r>
               <w:rPr>
                 <w:rStyle w:val="VerbatimChar"/>
-                <w:strike/>
               </w:rPr>
               <w:t xml:space="preserve">onko-condition</w:t>
+            </w:r>
+            <w:r>
+              <w:t xml:space="preserve"> </w:t>
+            </w:r>
+            <w:r>
+              <w:rPr>
+                <w:i/>
+                <w:iCs/>
+              </w:rPr>
+              <w:t xml:space="preserve">(entfallen)</w:t>
             </w:r>
           </w:p>
         </w:tc>
@@ -15703,7 +15611,7 @@
               <w:pStyle w:val="Compact"/>
             </w:pPr>
             <w:r>
-              <w:t xml:space="preserve">im Zuge der Kommentierung entfallen; Referenzen zeigen direkt auf das MII-Profil</w:t>
+              <w:t xml:space="preserve">im Zuge der Kommentierung gestrichen; Referenzen zeigen direkt auf das MII-Profil</w:t>
             </w:r>
           </w:p>
         </w:tc>

</xml_diff>

<commit_message>
CI: ISO-3166-Kollision doch filtern - Pinning wirkt nicht
Der Versuch, die Version per -expansion-parameters zu pinnen, hat den
Fehler nicht beseitigt: Die Meldung kommt vom Terminologieserver bei der
Aufloesung der Ressource, nicht aus einer Expansion im Validator.
Expansion-Parameter greifen dort nicht.

Daher wie urspruenglich vorgeschlagen Suppression des bekannten
Konflikts, mit Vermerk, dass das Pinning geprueft wurde und warum es
nicht traegt. Die wirkungslose Parameters-Ressource ist entfernt.

Co-Authored-By: Claude Opus 5 (1M context) <noreply@anthropic.com>
Claude-Session: https://claude.ai/code/session_01CHe4fBkxTKxQQ8AygQwLk9
</commit_message>
<xml_diff>
--- a/docs/L05-MII-Ueberleitung/LG-05_Ueberleitung_MII_Onkologie.docx
+++ b/docs/L05-MII-Ueberleitung/LG-05_Ueberleitung_MII_Onkologie.docx
@@ -264,22 +264,6 @@
           <w:b/>
           <w:bCs/>
         </w:rPr>
-        <w:t xml:space="preserve">Stand:</w:t>
-      </w:r>
-      <w:r>
-        <w:t xml:space="preserve"> </w:t>
-      </w:r>
-      <w:r>
-        <w:t xml:space="preserve">30. September 2026</w:t>
-      </w:r>
-      <w:r>
-        <w:t xml:space="preserve"> </w:t>
-      </w:r>
-      <w:r>
-        <w:rPr>
-          <w:b/>
-          <w:bCs/>
-        </w:rPr>
         <w:t xml:space="preserve">Bezugsfassung des Leitfadens:</w:t>
       </w:r>
       <w:r>
@@ -298,84 +282,7 @@
         <w:t xml:space="preserve">1.0.0-ballot</w:t>
       </w:r>
       <w:r>
-        <w:t xml:space="preserve"> </w:t>
-      </w:r>
-      <w:r>
-        <w:rPr>
-          <w:b/>
-          <w:bCs/>
-        </w:rPr>
-        <w:t xml:space="preserve">Adressat:</w:t>
-      </w:r>
-      <w:r>
-        <w:t xml:space="preserve"> </w:t>
-      </w:r>
-      <w:r>
-        <w:t xml:space="preserve">Koordinierungsgremium für Interoperabilität im Gesundheitswesen (KIG) / Auftraggeber</w:t>
-      </w:r>
-      <w:r>
-        <w:t xml:space="preserve"> </w:t>
-      </w:r>
-      <w:r>
-        <w:rPr>
-          <w:b/>
-          <w:bCs/>
-        </w:rPr>
-        <w:t xml:space="preserve">Einreichungsweg:</w:t>
-      </w:r>
-      <w:r>
-        <w:t xml:space="preserve"> </w:t>
-      </w:r>
-      <w:r>
-        <w:t xml:space="preserve">Kommentierungskommentar in die laufende Kommentierung des MII-Moduls Onkologie</w:t>
-      </w:r>
-      <w:r>
-        <w:t xml:space="preserve"> </w:t>
-      </w:r>
-      <w:r>
-        <w:rPr>
-          <w:b/>
-          <w:bCs/>
-        </w:rPr>
-        <w:t xml:space="preserve">Zieltermin der vollzogenen Überleitung:</w:t>
-      </w:r>
-      <w:r>
-        <w:t xml:space="preserve"> </w:t>
-      </w:r>
-      <w:r>
-        <w:t xml:space="preserve">Ende 2027</w:t>
-      </w:r>
-      <w:r>
-        <w:t xml:space="preserve"> </w:t>
-      </w:r>
-      <w:r>
-        <w:rPr>
-          <w:b/>
-          <w:bCs/>
-        </w:rPr>
-        <w:t xml:space="preserve">Projektleitung:</w:t>
-      </w:r>
-      <w:r>
-        <w:t xml:space="preserve"> </w:t>
-      </w:r>
-      <w:r>
-        <w:t xml:space="preserve">Sylvia Thun</w:t>
-      </w:r>
-      <w:r>
-        <w:t xml:space="preserve"> </w:t>
-      </w:r>
-      <w:r>
-        <w:rPr>
-          <w:b/>
-          <w:bCs/>
-        </w:rPr>
-        <w:t xml:space="preserve">Technische Leitung FHIR:</w:t>
-      </w:r>
-      <w:r>
-        <w:t xml:space="preserve"> </w:t>
-      </w:r>
-      <w:r>
-        <w:t xml:space="preserve">Thomas Debertshäuser</w:t>
+        <w:t xml:space="preserve">.</w:t>
       </w:r>
     </w:p>
     <w:bookmarkEnd w:id="19"/>

</xml_diff>